<commit_message>
Change #2: Update concurrent users requirement(SRS v1.2)
</commit_message>
<xml_diff>
--- a/ECMS_SRS.docx
+++ b/ECMS_SRS.docx
@@ -166,53 +166,37 @@
           <w:sz w:val="28"/>
           <w:szCs w:val="28"/>
         </w:rPr>
-        <w:t>The E-Commerce Store Management System is an online system developed to simplify the process of buying and managing products. Customers can browse available products, search for required items, add products to their shopping cart, place orders and make pay</w:t>
-      </w:r>
-      <w:r>
-        <w:rPr>
-          <w:rFonts w:ascii="Times New Roman" w:eastAsia="Times New Roman" w:hAnsi="Times New Roman" w:cs="Times New Roman"/>
-          <w:sz w:val="28"/>
-          <w:szCs w:val="28"/>
-        </w:rPr>
-        <w:t>ments. The system also provides facilities for administrators to manage products, inventory, customers and orders.</w:t>
-      </w:r>
-    </w:p>
-    <w:p>
-      <w:pPr>
-        <w:pStyle w:val="normal0"/>
-        <w:jc w:val="both"/>
-        <w:rPr>
-          <w:rFonts w:ascii="Times New Roman" w:eastAsia="Times New Roman" w:hAnsi="Times New Roman" w:cs="Times New Roman"/>
-          <w:sz w:val="28"/>
-          <w:szCs w:val="28"/>
-        </w:rPr>
-      </w:pPr>
-    </w:p>
-    <w:p>
-      <w:pPr>
-        <w:pStyle w:val="normal0"/>
-        <w:jc w:val="both"/>
-        <w:rPr>
-          <w:rFonts w:ascii="Times New Roman" w:eastAsia="Times New Roman" w:hAnsi="Times New Roman" w:cs="Times New Roman"/>
-          <w:sz w:val="28"/>
-          <w:szCs w:val="28"/>
-        </w:rPr>
-      </w:pPr>
-      <w:r>
-        <w:rPr>
-          <w:rFonts w:ascii="Times New Roman" w:eastAsia="Times New Roman" w:hAnsi="Times New Roman" w:cs="Times New Roman"/>
-          <w:sz w:val="28"/>
-          <w:szCs w:val="28"/>
-        </w:rPr>
-        <w:t xml:space="preserve">This Software Requirements Specification (SRS) describes the functional and non-functional requirements of the proposed system. It provides </w:t>
-      </w:r>
-      <w:r>
-        <w:rPr>
-          <w:rFonts w:ascii="Times New Roman" w:eastAsia="Times New Roman" w:hAnsi="Times New Roman" w:cs="Times New Roman"/>
-          <w:sz w:val="28"/>
-          <w:szCs w:val="28"/>
-        </w:rPr>
-        <w:t>a common understanding of the system requirements for users, developers and other stakeholders.</w:t>
+        <w:t>The E-Commerce Store Management System is an online system developed to simplify the process of buying and managing products. Customers can browse available products, search for required items, add products to their shopping cart, place orders and make payments. The system also provides facilities for administrators to manage products, inventory, customers and orders.</w:t>
+      </w:r>
+    </w:p>
+    <w:p>
+      <w:pPr>
+        <w:pStyle w:val="normal0"/>
+        <w:jc w:val="both"/>
+        <w:rPr>
+          <w:rFonts w:ascii="Times New Roman" w:eastAsia="Times New Roman" w:hAnsi="Times New Roman" w:cs="Times New Roman"/>
+          <w:sz w:val="28"/>
+          <w:szCs w:val="28"/>
+        </w:rPr>
+      </w:pPr>
+    </w:p>
+    <w:p>
+      <w:pPr>
+        <w:pStyle w:val="normal0"/>
+        <w:jc w:val="both"/>
+        <w:rPr>
+          <w:rFonts w:ascii="Times New Roman" w:eastAsia="Times New Roman" w:hAnsi="Times New Roman" w:cs="Times New Roman"/>
+          <w:sz w:val="28"/>
+          <w:szCs w:val="28"/>
+        </w:rPr>
+      </w:pPr>
+      <w:r>
+        <w:rPr>
+          <w:rFonts w:ascii="Times New Roman" w:eastAsia="Times New Roman" w:hAnsi="Times New Roman" w:cs="Times New Roman"/>
+          <w:sz w:val="28"/>
+          <w:szCs w:val="28"/>
+        </w:rPr>
+        <w:t>This Software Requirements Specification (SRS) describes the functional and non-functional requirements of the proposed system. It provides a common understanding of the system requirements for users, developers and other stakeholders.</w:t>
       </w:r>
     </w:p>
     <w:p>
@@ -265,15 +249,7 @@
           <w:sz w:val="28"/>
           <w:szCs w:val="28"/>
         </w:rPr>
-        <w:t xml:space="preserve">The purpose of this document is to specify the requirements of the E-Commerce Store Management System. It describes the functions </w:t>
-      </w:r>
-      <w:r>
-        <w:rPr>
-          <w:rFonts w:ascii="Times New Roman" w:eastAsia="Times New Roman" w:hAnsi="Times New Roman" w:cs="Times New Roman"/>
-          <w:sz w:val="28"/>
-          <w:szCs w:val="28"/>
-        </w:rPr>
-        <w:t>provided by the system, user requirements, interface requirements, performance requirements and other non-functional requirements.</w:t>
+        <w:t>The purpose of this document is to specify the requirements of the E-Commerce Store Management System. It describes the functions provided by the system, user requirements, interface requirements, performance requirements and other non-functional requirements.</w:t>
       </w:r>
     </w:p>
     <w:p>
@@ -337,17 +313,7 @@
           <w:sz w:val="28"/>
           <w:szCs w:val="28"/>
         </w:rPr>
-        <w:t>1.2 Scope o</w:t>
-      </w:r>
-      <w:r>
-        <w:rPr>
-          <w:rFonts w:ascii="Times New Roman" w:eastAsia="Times New Roman" w:hAnsi="Times New Roman" w:cs="Times New Roman"/>
-          <w:b/>
-          <w:bCs/>
-          <w:sz w:val="28"/>
-          <w:szCs w:val="28"/>
-        </w:rPr>
-        <w:t>f this Document</w:t>
+        <w:t>1.2 Scope of this Document</w:t>
       </w:r>
     </w:p>
     <w:p>
@@ -397,53 +363,37 @@
           <w:szCs w:val="28"/>
         </w:rPr>
         <w:lastRenderedPageBreak/>
-        <w:t>The main scope of the system includes customer registration and login, product browsing, p</w:t>
-      </w:r>
-      <w:r>
-        <w:rPr>
-          <w:rFonts w:ascii="Times New Roman" w:eastAsia="Times New Roman" w:hAnsi="Times New Roman" w:cs="Times New Roman"/>
-          <w:sz w:val="28"/>
-          <w:szCs w:val="28"/>
-        </w:rPr>
-        <w:t>roduct searching, shopping cart management, order placement, online payment and order tracking. The administrator can add, update and remove products, manage inventory, process customer orders and maintain product information.</w:t>
-      </w:r>
-    </w:p>
-    <w:p>
-      <w:pPr>
-        <w:pStyle w:val="normal0"/>
-        <w:jc w:val="both"/>
-        <w:rPr>
-          <w:rFonts w:ascii="Times New Roman" w:eastAsia="Times New Roman" w:hAnsi="Times New Roman" w:cs="Times New Roman"/>
-          <w:sz w:val="28"/>
-          <w:szCs w:val="28"/>
-        </w:rPr>
-      </w:pPr>
-    </w:p>
-    <w:p>
-      <w:pPr>
-        <w:pStyle w:val="normal0"/>
-        <w:jc w:val="both"/>
-        <w:rPr>
-          <w:rFonts w:ascii="Times New Roman" w:eastAsia="Times New Roman" w:hAnsi="Times New Roman" w:cs="Times New Roman"/>
-          <w:sz w:val="28"/>
-          <w:szCs w:val="28"/>
-        </w:rPr>
-      </w:pPr>
-      <w:r>
-        <w:rPr>
-          <w:rFonts w:ascii="Times New Roman" w:eastAsia="Times New Roman" w:hAnsi="Times New Roman" w:cs="Times New Roman"/>
-          <w:sz w:val="28"/>
-          <w:szCs w:val="28"/>
-        </w:rPr>
-        <w:t>The system is intended to ma</w:t>
-      </w:r>
-      <w:r>
-        <w:rPr>
-          <w:rFonts w:ascii="Times New Roman" w:eastAsia="Times New Roman" w:hAnsi="Times New Roman" w:cs="Times New Roman"/>
-          <w:sz w:val="28"/>
-          <w:szCs w:val="28"/>
-        </w:rPr>
-        <w:t>ke the shopping process convenient for customers and reduce manual work involved in store management.</w:t>
+        <w:t>The main scope of the system includes customer registration and login, product browsing, product searching, shopping cart management, order placement, online payment and order tracking. The administrator can add, update and remove products, manage inventory, process customer orders and maintain product information.</w:t>
+      </w:r>
+    </w:p>
+    <w:p>
+      <w:pPr>
+        <w:pStyle w:val="normal0"/>
+        <w:jc w:val="both"/>
+        <w:rPr>
+          <w:rFonts w:ascii="Times New Roman" w:eastAsia="Times New Roman" w:hAnsi="Times New Roman" w:cs="Times New Roman"/>
+          <w:sz w:val="28"/>
+          <w:szCs w:val="28"/>
+        </w:rPr>
+      </w:pPr>
+    </w:p>
+    <w:p>
+      <w:pPr>
+        <w:pStyle w:val="normal0"/>
+        <w:jc w:val="both"/>
+        <w:rPr>
+          <w:rFonts w:ascii="Times New Roman" w:eastAsia="Times New Roman" w:hAnsi="Times New Roman" w:cs="Times New Roman"/>
+          <w:sz w:val="28"/>
+          <w:szCs w:val="28"/>
+        </w:rPr>
+      </w:pPr>
+      <w:r>
+        <w:rPr>
+          <w:rFonts w:ascii="Times New Roman" w:eastAsia="Times New Roman" w:hAnsi="Times New Roman" w:cs="Times New Roman"/>
+          <w:sz w:val="28"/>
+          <w:szCs w:val="28"/>
+        </w:rPr>
+        <w:t>The system is intended to make the shopping process convenient for customers and reduce manual work involved in store management.</w:t>
       </w:r>
     </w:p>
     <w:p>
@@ -526,15 +476,7 @@
           <w:sz w:val="28"/>
           <w:szCs w:val="28"/>
         </w:rPr>
-        <w:t>Customers use the system for shopping-related activities such</w:t>
-      </w:r>
-      <w:r>
-        <w:rPr>
-          <w:rFonts w:ascii="Times New Roman" w:eastAsia="Times New Roman" w:hAnsi="Times New Roman" w:cs="Times New Roman"/>
-          <w:sz w:val="28"/>
-          <w:szCs w:val="28"/>
-        </w:rPr>
-        <w:t xml:space="preserve"> as searching products, adding products to the cart and placing orders. Administrators manage the overall operation of the store, including products, inventory and orders.</w:t>
+        <w:t>Customers use the system for shopping-related activities such as searching products, adding products to the cart and placing orders. Administrators manage the overall operation of the store, including products, inventory and orders.</w:t>
       </w:r>
     </w:p>
     <w:p>
@@ -617,53 +559,37 @@
           <w:sz w:val="28"/>
           <w:szCs w:val="28"/>
         </w:rPr>
-        <w:t xml:space="preserve">Traditional store management requires </w:t>
-      </w:r>
-      <w:r>
-        <w:rPr>
-          <w:rFonts w:ascii="Times New Roman" w:eastAsia="Times New Roman" w:hAnsi="Times New Roman" w:cs="Times New Roman"/>
-          <w:sz w:val="28"/>
-          <w:szCs w:val="28"/>
-        </w:rPr>
-        <w:t>customers to physically visit a store and requires staff to manually manage many activities. An e-commerce system provides a centralized platform through which products can be sold and managed online.</w:t>
-      </w:r>
-    </w:p>
-    <w:p>
-      <w:pPr>
-        <w:pStyle w:val="normal0"/>
-        <w:jc w:val="both"/>
-        <w:rPr>
-          <w:rFonts w:ascii="Times New Roman" w:eastAsia="Times New Roman" w:hAnsi="Times New Roman" w:cs="Times New Roman"/>
-          <w:sz w:val="28"/>
-          <w:szCs w:val="28"/>
-        </w:rPr>
-      </w:pPr>
-    </w:p>
-    <w:p>
-      <w:pPr>
-        <w:pStyle w:val="normal0"/>
-        <w:jc w:val="both"/>
-        <w:rPr>
-          <w:rFonts w:ascii="Times New Roman" w:eastAsia="Times New Roman" w:hAnsi="Times New Roman" w:cs="Times New Roman"/>
-          <w:sz w:val="28"/>
-          <w:szCs w:val="28"/>
-        </w:rPr>
-      </w:pPr>
-      <w:r>
-        <w:rPr>
-          <w:rFonts w:ascii="Times New Roman" w:eastAsia="Times New Roman" w:hAnsi="Times New Roman" w:cs="Times New Roman"/>
-          <w:sz w:val="28"/>
-          <w:szCs w:val="28"/>
-        </w:rPr>
-        <w:t>The proposed system helps the business reach customers</w:t>
-      </w:r>
-      <w:r>
-        <w:rPr>
-          <w:rFonts w:ascii="Times New Roman" w:eastAsia="Times New Roman" w:hAnsi="Times New Roman" w:cs="Times New Roman"/>
-          <w:sz w:val="28"/>
-          <w:szCs w:val="28"/>
-        </w:rPr>
-        <w:t xml:space="preserve"> through the internet and provides better management of products, inventory and orders. It also helps customers shop at any time and from any location where internet access is available.</w:t>
+        <w:t>Traditional store management requires customers to physically visit a store and requires staff to manually manage many activities. An e-commerce system provides a centralized platform through which products can be sold and managed online.</w:t>
+      </w:r>
+    </w:p>
+    <w:p>
+      <w:pPr>
+        <w:pStyle w:val="normal0"/>
+        <w:jc w:val="both"/>
+        <w:rPr>
+          <w:rFonts w:ascii="Times New Roman" w:eastAsia="Times New Roman" w:hAnsi="Times New Roman" w:cs="Times New Roman"/>
+          <w:sz w:val="28"/>
+          <w:szCs w:val="28"/>
+        </w:rPr>
+      </w:pPr>
+    </w:p>
+    <w:p>
+      <w:pPr>
+        <w:pStyle w:val="normal0"/>
+        <w:jc w:val="both"/>
+        <w:rPr>
+          <w:rFonts w:ascii="Times New Roman" w:eastAsia="Times New Roman" w:hAnsi="Times New Roman" w:cs="Times New Roman"/>
+          <w:sz w:val="28"/>
+          <w:szCs w:val="28"/>
+        </w:rPr>
+      </w:pPr>
+      <w:r>
+        <w:rPr>
+          <w:rFonts w:ascii="Times New Roman" w:eastAsia="Times New Roman" w:hAnsi="Times New Roman" w:cs="Times New Roman"/>
+          <w:sz w:val="28"/>
+          <w:szCs w:val="28"/>
+        </w:rPr>
+        <w:t>The proposed system helps the business reach customers through the internet and provides better management of products, inventory and orders. It also helps customers shop at any time and from any location where internet access is available.</w:t>
       </w:r>
     </w:p>
     <w:p>
@@ -717,15 +643,7 @@
           <w:szCs w:val="28"/>
         </w:rPr>
         <w:lastRenderedPageBreak/>
-        <w:t>The E-Commerce Store Management System is a w</w:t>
-      </w:r>
-      <w:r>
-        <w:rPr>
-          <w:rFonts w:ascii="Times New Roman" w:eastAsia="Times New Roman" w:hAnsi="Times New Roman" w:cs="Times New Roman"/>
-          <w:sz w:val="28"/>
-          <w:szCs w:val="28"/>
-        </w:rPr>
-        <w:t>eb-based system that connects customers with the online store. It maintains information related to users, products, inventory, shopping carts, orders and payments.</w:t>
+        <w:t>The E-Commerce Store Management System is a web-based system that connects customers with the online store. It maintains information related to users, products, inventory, shopping carts, orders and payments.</w:t>
       </w:r>
     </w:p>
     <w:p>
@@ -801,15 +719,7 @@
           <w:sz w:val="28"/>
           <w:szCs w:val="28"/>
         </w:rPr>
-        <w:t>Customer registration</w:t>
-      </w:r>
-      <w:r>
-        <w:rPr>
-          <w:rFonts w:ascii="Times New Roman" w:eastAsia="Times New Roman" w:hAnsi="Times New Roman" w:cs="Times New Roman"/>
-          <w:sz w:val="28"/>
-          <w:szCs w:val="28"/>
-        </w:rPr>
-        <w:t xml:space="preserve"> and login</w:t>
+        <w:t>Customer registration and login</w:t>
       </w:r>
     </w:p>
     <w:p>
@@ -1138,15 +1048,7 @@
           <w:sz w:val="28"/>
           <w:szCs w:val="28"/>
         </w:rPr>
-        <w:t>The proposed system follows the basic working concept of commonly available online shopping systems. Such systems allow customers to se</w:t>
-      </w:r>
-      <w:r>
-        <w:rPr>
-          <w:rFonts w:ascii="Times New Roman" w:eastAsia="Times New Roman" w:hAnsi="Times New Roman" w:cs="Times New Roman"/>
-          <w:sz w:val="28"/>
-          <w:szCs w:val="28"/>
-        </w:rPr>
-        <w:t>arch for products, add products to a cart and complete purchases online.</w:t>
+        <w:t>The proposed system follows the basic working concept of commonly available online shopping systems. Such systems allow customers to search for products, add products to a cart and complete purchases online.</w:t>
       </w:r>
     </w:p>
     <w:p>
@@ -1260,15 +1162,7 @@
           <w:szCs w:val="28"/>
         </w:rPr>
         <w:lastRenderedPageBreak/>
-        <w:t xml:space="preserve">Administrator: The </w:t>
-      </w:r>
-      <w:r>
-        <w:rPr>
-          <w:rFonts w:ascii="Times New Roman" w:eastAsia="Times New Roman" w:hAnsi="Times New Roman" w:cs="Times New Roman"/>
-          <w:sz w:val="28"/>
-          <w:szCs w:val="28"/>
-        </w:rPr>
-        <w:t>administrator should have knowledge about store operations. The administrator is responsible for managing products, product categories, stock quantities, customer orders and other store information.</w:t>
+        <w:t>Administrator: The administrator should have knowledge about store operations. The administrator is responsible for managing products, product categories, stock quantities, customer orders and other store information.</w:t>
       </w:r>
     </w:p>
     <w:p>
@@ -1321,53 +1215,37 @@
           <w:sz w:val="28"/>
           <w:szCs w:val="28"/>
         </w:rPr>
-        <w:t>In a traditional shopping sys</w:t>
-      </w:r>
-      <w:r>
-        <w:rPr>
-          <w:rFonts w:ascii="Times New Roman" w:eastAsia="Times New Roman" w:hAnsi="Times New Roman" w:cs="Times New Roman"/>
-          <w:sz w:val="28"/>
-          <w:szCs w:val="28"/>
-        </w:rPr>
-        <w:t>tem, customers have to visit the store physically to check product availability and purchase products. It can also be difficult for store administrators to manually maintain product, stock and order information.</w:t>
-      </w:r>
-    </w:p>
-    <w:p>
-      <w:pPr>
-        <w:pStyle w:val="normal0"/>
-        <w:jc w:val="both"/>
-        <w:rPr>
-          <w:rFonts w:ascii="Times New Roman" w:eastAsia="Times New Roman" w:hAnsi="Times New Roman" w:cs="Times New Roman"/>
-          <w:sz w:val="28"/>
-          <w:szCs w:val="28"/>
-        </w:rPr>
-      </w:pPr>
-    </w:p>
-    <w:p>
-      <w:pPr>
-        <w:pStyle w:val="normal0"/>
-        <w:jc w:val="both"/>
-        <w:rPr>
-          <w:rFonts w:ascii="Times New Roman" w:eastAsia="Times New Roman" w:hAnsi="Times New Roman" w:cs="Times New Roman"/>
-          <w:sz w:val="28"/>
-          <w:szCs w:val="28"/>
-        </w:rPr>
-      </w:pPr>
-      <w:r>
-        <w:rPr>
-          <w:rFonts w:ascii="Times New Roman" w:eastAsia="Times New Roman" w:hAnsi="Times New Roman" w:cs="Times New Roman"/>
-          <w:sz w:val="28"/>
-          <w:szCs w:val="28"/>
-        </w:rPr>
-        <w:t>Therefore, there is a need for a system tha</w:t>
-      </w:r>
-      <w:r>
-        <w:rPr>
-          <w:rFonts w:ascii="Times New Roman" w:eastAsia="Times New Roman" w:hAnsi="Times New Roman" w:cs="Times New Roman"/>
-          <w:sz w:val="28"/>
-          <w:szCs w:val="28"/>
-        </w:rPr>
-        <w:t>t provides online shopping facilities to customers while providing centralized management facilities to administrators.</w:t>
+        <w:t>In a traditional shopping system, customers have to visit the store physically to check product availability and purchase products. It can also be difficult for store administrators to manually maintain product, stock and order information.</w:t>
+      </w:r>
+    </w:p>
+    <w:p>
+      <w:pPr>
+        <w:pStyle w:val="normal0"/>
+        <w:jc w:val="both"/>
+        <w:rPr>
+          <w:rFonts w:ascii="Times New Roman" w:eastAsia="Times New Roman" w:hAnsi="Times New Roman" w:cs="Times New Roman"/>
+          <w:sz w:val="28"/>
+          <w:szCs w:val="28"/>
+        </w:rPr>
+      </w:pPr>
+    </w:p>
+    <w:p>
+      <w:pPr>
+        <w:pStyle w:val="normal0"/>
+        <w:jc w:val="both"/>
+        <w:rPr>
+          <w:rFonts w:ascii="Times New Roman" w:eastAsia="Times New Roman" w:hAnsi="Times New Roman" w:cs="Times New Roman"/>
+          <w:sz w:val="28"/>
+          <w:szCs w:val="28"/>
+        </w:rPr>
+      </w:pPr>
+      <w:r>
+        <w:rPr>
+          <w:rFonts w:ascii="Times New Roman" w:eastAsia="Times New Roman" w:hAnsi="Times New Roman" w:cs="Times New Roman"/>
+          <w:sz w:val="28"/>
+          <w:szCs w:val="28"/>
+        </w:rPr>
+        <w:t>Therefore, there is a need for a system that provides online shopping facilities to customers while providing centralized management facilities to administrators.</w:t>
       </w:r>
     </w:p>
     <w:p>
@@ -1420,15 +1298,25 @@
           <w:sz w:val="28"/>
           <w:szCs w:val="28"/>
         </w:rPr>
-        <w:t xml:space="preserve">The main objectives are to provide customers with a simple and convenient shopping platform, allow quick searching </w:t>
-      </w:r>
-      <w:r>
-        <w:rPr>
-          <w:rFonts w:ascii="Times New Roman" w:eastAsia="Times New Roman" w:hAnsi="Times New Roman" w:cs="Times New Roman"/>
-          <w:sz w:val="28"/>
-          <w:szCs w:val="28"/>
-        </w:rPr>
-        <w:t>and browsing of products, provide secure order and payment processing, maintain proper order records and help administrators efficiently manage products and inventory.</w:t>
+        <w:t xml:space="preserve">The main objectives are to provide customers with a simple and convenient shopping </w:t>
+      </w:r>
+      <w:proofErr w:type="gramStart"/>
+      <w:r>
+        <w:rPr>
+          <w:rFonts w:ascii="Times New Roman" w:eastAsia="Times New Roman" w:hAnsi="Times New Roman" w:cs="Times New Roman"/>
+          <w:sz w:val="28"/>
+          <w:szCs w:val="28"/>
+        </w:rPr>
+        <w:t>platform,</w:t>
+      </w:r>
+      <w:proofErr w:type="gramEnd"/>
+      <w:r>
+        <w:rPr>
+          <w:rFonts w:ascii="Times New Roman" w:eastAsia="Times New Roman" w:hAnsi="Times New Roman" w:cs="Times New Roman"/>
+          <w:sz w:val="28"/>
+          <w:szCs w:val="28"/>
+        </w:rPr>
+        <w:t xml:space="preserve"> allow quick searching and browsing of products, provide secure order and payment processing, maintain proper order records and help administrators efficiently manage products and inventory.</w:t>
       </w:r>
     </w:p>
     <w:p>
@@ -1481,15 +1369,7 @@
           <w:sz w:val="28"/>
           <w:szCs w:val="28"/>
         </w:rPr>
-        <w:t xml:space="preserve">The system requires an internet connection and a supported web </w:t>
-      </w:r>
-      <w:r>
-        <w:rPr>
-          <w:rFonts w:ascii="Times New Roman" w:eastAsia="Times New Roman" w:hAnsi="Times New Roman" w:cs="Times New Roman"/>
-          <w:sz w:val="28"/>
-          <w:szCs w:val="28"/>
-        </w:rPr>
-        <w:t>browser. Customers must provide valid information while creating an account and placing an order. Payment processing depends on the availability of the selected payment service. Administrative functions must only be accessible to authorized administrators.</w:t>
+        <w:t>The system requires an internet connection and a supported web browser. Customers must provide valid information while creating an account and placing an order. Payment processing depends on the availability of the selected payment service. Administrative functions must only be accessible to authorized administrators.</w:t>
       </w:r>
     </w:p>
     <w:p>
@@ -1542,15 +1422,25 @@
           <w:sz w:val="28"/>
           <w:szCs w:val="28"/>
         </w:rPr>
-        <w:t>The functional requirements describe the operations that the E-Commerce Store Management System shall perform. Following the style used in the reference SRS, individual requirements are expressed using “The system shall…” state</w:t>
-      </w:r>
-      <w:r>
-        <w:rPr>
-          <w:rFonts w:ascii="Times New Roman" w:eastAsia="Times New Roman" w:hAnsi="Times New Roman" w:cs="Times New Roman"/>
-          <w:sz w:val="28"/>
-          <w:szCs w:val="28"/>
-        </w:rPr>
-        <w:t>ments.</w:t>
+        <w:t xml:space="preserve">The functional requirements describe the operations that the E-Commerce Store Management System shall perform. Following the style used in the reference </w:t>
+      </w:r>
+      <w:proofErr w:type="gramStart"/>
+      <w:r>
+        <w:rPr>
+          <w:rFonts w:ascii="Times New Roman" w:eastAsia="Times New Roman" w:hAnsi="Times New Roman" w:cs="Times New Roman"/>
+          <w:sz w:val="28"/>
+          <w:szCs w:val="28"/>
+        </w:rPr>
+        <w:t>SRS,</w:t>
+      </w:r>
+      <w:proofErr w:type="gramEnd"/>
+      <w:r>
+        <w:rPr>
+          <w:rFonts w:ascii="Times New Roman" w:eastAsia="Times New Roman" w:hAnsi="Times New Roman" w:cs="Times New Roman"/>
+          <w:sz w:val="28"/>
+          <w:szCs w:val="28"/>
+        </w:rPr>
+        <w:t xml:space="preserve"> individual requirements are expressed using “The system shall…” statements.</w:t>
       </w:r>
     </w:p>
     <w:p>
@@ -1837,15 +1727,7 @@
           <w:sz w:val="28"/>
           <w:szCs w:val="28"/>
         </w:rPr>
-        <w:t>The system shall display product information such as product nam</w:t>
-      </w:r>
-      <w:r>
-        <w:rPr>
-          <w:rFonts w:ascii="Times New Roman" w:eastAsia="Times New Roman" w:hAnsi="Times New Roman" w:cs="Times New Roman"/>
-          <w:sz w:val="28"/>
-          <w:szCs w:val="28"/>
-        </w:rPr>
-        <w:t>e, description, price and availability.</w:t>
+        <w:t>The system shall display product information such as product name, description, price and availability.</w:t>
       </w:r>
     </w:p>
     <w:p>
@@ -1958,15 +1840,7 @@
           <w:sz w:val="28"/>
           <w:szCs w:val="28"/>
         </w:rPr>
-        <w:t xml:space="preserve">The system shall allow customers to remove </w:t>
-      </w:r>
-      <w:r>
-        <w:rPr>
-          <w:rFonts w:ascii="Times New Roman" w:eastAsia="Times New Roman" w:hAnsi="Times New Roman" w:cs="Times New Roman"/>
-          <w:sz w:val="28"/>
-          <w:szCs w:val="28"/>
-        </w:rPr>
-        <w:t>products from the cart.</w:t>
+        <w:t>The system shall allow customers to remove products from the cart.</w:t>
       </w:r>
     </w:p>
     <w:p>
@@ -2078,15 +1952,7 @@
           <w:sz w:val="28"/>
           <w:szCs w:val="28"/>
         </w:rPr>
-        <w:t>The system shall collect the required deli</w:t>
-      </w:r>
-      <w:r>
-        <w:rPr>
-          <w:rFonts w:ascii="Times New Roman" w:eastAsia="Times New Roman" w:hAnsi="Times New Roman" w:cs="Times New Roman"/>
-          <w:sz w:val="28"/>
-          <w:szCs w:val="28"/>
-        </w:rPr>
-        <w:t>very information before confirming an order.</w:t>
+        <w:t>The system shall collect the required delivery information before confirming an order.</w:t>
       </w:r>
     </w:p>
     <w:p>
@@ -2289,15 +2155,7 @@
           <w:sz w:val="28"/>
           <w:szCs w:val="28"/>
         </w:rPr>
-        <w:t xml:space="preserve">The system shall display an appropriate message </w:t>
-      </w:r>
-      <w:r>
-        <w:rPr>
-          <w:rFonts w:ascii="Times New Roman" w:eastAsia="Times New Roman" w:hAnsi="Times New Roman" w:cs="Times New Roman"/>
-          <w:sz w:val="28"/>
-          <w:szCs w:val="28"/>
-        </w:rPr>
-        <w:t>if a payment transaction fails.</w:t>
+        <w:t>The system shall display an appropriate message if a payment transaction fails.</w:t>
       </w:r>
     </w:p>
     <w:p>
@@ -2492,17 +2350,7 @@
           <w:sz w:val="28"/>
           <w:szCs w:val="28"/>
         </w:rPr>
-        <w:t>3.7 P</w:t>
-      </w:r>
-      <w:r>
-        <w:rPr>
-          <w:rFonts w:ascii="Times New Roman" w:eastAsia="Times New Roman" w:hAnsi="Times New Roman" w:cs="Times New Roman"/>
-          <w:b/>
-          <w:bCs/>
-          <w:sz w:val="28"/>
-          <w:szCs w:val="28"/>
-        </w:rPr>
-        <w:t>roduct and Inventory Management</w:t>
+        <w:t>3.7 Product and Inventory Management</w:t>
       </w:r>
     </w:p>
     <w:p>
@@ -2844,15 +2692,7 @@
           <w:sz w:val="28"/>
           <w:szCs w:val="28"/>
         </w:rPr>
-        <w:t>The system shall provide a simple graphical user interface accessible thro</w:t>
-      </w:r>
-      <w:r>
-        <w:rPr>
-          <w:rFonts w:ascii="Times New Roman" w:eastAsia="Times New Roman" w:hAnsi="Times New Roman" w:cs="Times New Roman"/>
-          <w:sz w:val="28"/>
-          <w:szCs w:val="28"/>
-        </w:rPr>
-        <w:t>ugh a web browser.</w:t>
+        <w:t>The system shall provide a simple graphical user interface accessible through a web browser.</w:t>
       </w:r>
     </w:p>
     <w:p>
@@ -2912,8 +2752,101 @@
           <w:sz w:val="28"/>
           <w:szCs w:val="28"/>
         </w:rPr>
-        <w:t>The administrator interface shall provide facilities for managing products, inventory and orders</w:t>
-      </w:r>
+        <w:t>The administrator interface shall provide facilities for managing products, inventory and orders.</w:t>
+      </w:r>
+    </w:p>
+    <w:p>
+      <w:pPr>
+        <w:pStyle w:val="normal0"/>
+        <w:jc w:val="both"/>
+        <w:rPr>
+          <w:rFonts w:ascii="Times New Roman" w:eastAsia="Times New Roman" w:hAnsi="Times New Roman" w:cs="Times New Roman"/>
+          <w:sz w:val="28"/>
+          <w:szCs w:val="28"/>
+        </w:rPr>
+      </w:pPr>
+    </w:p>
+    <w:p>
+      <w:pPr>
+        <w:pStyle w:val="normal0"/>
+        <w:jc w:val="both"/>
+        <w:rPr>
+          <w:rFonts w:ascii="Times New Roman" w:eastAsia="Times New Roman" w:hAnsi="Times New Roman" w:cs="Times New Roman"/>
+          <w:sz w:val="28"/>
+          <w:szCs w:val="28"/>
+        </w:rPr>
+      </w:pPr>
+      <w:r>
+        <w:rPr>
+          <w:rFonts w:ascii="Times New Roman" w:eastAsia="Times New Roman" w:hAnsi="Times New Roman" w:cs="Times New Roman"/>
+          <w:sz w:val="28"/>
+          <w:szCs w:val="28"/>
+        </w:rPr>
+        <w:t>The interface should maintain a consistent layout and provide clear navigation between different pages.</w:t>
+      </w:r>
+    </w:p>
+    <w:p>
+      <w:pPr>
+        <w:pStyle w:val="normal0"/>
+        <w:jc w:val="both"/>
+        <w:rPr>
+          <w:rFonts w:ascii="Times New Roman" w:eastAsia="Times New Roman" w:hAnsi="Times New Roman" w:cs="Times New Roman"/>
+          <w:sz w:val="28"/>
+          <w:szCs w:val="28"/>
+        </w:rPr>
+      </w:pPr>
+    </w:p>
+    <w:p>
+      <w:pPr>
+        <w:pStyle w:val="normal0"/>
+        <w:jc w:val="both"/>
+        <w:rPr>
+          <w:rFonts w:ascii="Times New Roman" w:eastAsia="Times New Roman" w:hAnsi="Times New Roman" w:cs="Times New Roman"/>
+          <w:b/>
+          <w:bCs/>
+          <w:sz w:val="28"/>
+          <w:szCs w:val="28"/>
+        </w:rPr>
+      </w:pPr>
+      <w:r>
+        <w:rPr>
+          <w:rFonts w:ascii="Times New Roman" w:eastAsia="Times New Roman" w:hAnsi="Times New Roman" w:cs="Times New Roman"/>
+          <w:b/>
+          <w:bCs/>
+          <w:sz w:val="28"/>
+          <w:szCs w:val="28"/>
+        </w:rPr>
+        <w:t>4.2 Hardware Interfaces</w:t>
+      </w:r>
+    </w:p>
+    <w:p>
+      <w:pPr>
+        <w:pStyle w:val="normal0"/>
+        <w:jc w:val="both"/>
+        <w:rPr>
+          <w:rFonts w:ascii="Times New Roman" w:eastAsia="Times New Roman" w:hAnsi="Times New Roman" w:cs="Times New Roman"/>
+          <w:sz w:val="28"/>
+          <w:szCs w:val="28"/>
+        </w:rPr>
+      </w:pPr>
+      <w:r>
+        <w:rPr>
+          <w:rFonts w:ascii="Times New Roman" w:eastAsia="Times New Roman" w:hAnsi="Times New Roman" w:cs="Times New Roman"/>
+          <w:sz w:val="28"/>
+          <w:szCs w:val="28"/>
+        </w:rPr>
+        <w:t xml:space="preserve">The system can be accessed using devices such as desktop computers, laptops, tablets and </w:t>
+      </w:r>
+      <w:proofErr w:type="spellStart"/>
+      <w:r>
+        <w:rPr>
+          <w:rFonts w:ascii="Times New Roman" w:eastAsia="Times New Roman" w:hAnsi="Times New Roman" w:cs="Times New Roman"/>
+          <w:sz w:val="28"/>
+          <w:szCs w:val="28"/>
+        </w:rPr>
+        <w:t>smartphones</w:t>
+      </w:r>
+      <w:proofErr w:type="spellEnd"/>
       <w:r>
         <w:rPr>
           <w:rFonts w:ascii="Times New Roman" w:eastAsia="Times New Roman" w:hAnsi="Times New Roman" w:cs="Times New Roman"/>
@@ -2950,98 +2883,7 @@
           <w:sz w:val="28"/>
           <w:szCs w:val="28"/>
         </w:rPr>
-        <w:t>The interface should maintain a consistent layout and provide clear navigation between different pages.</w:t>
-      </w:r>
-    </w:p>
-    <w:p>
-      <w:pPr>
-        <w:pStyle w:val="normal0"/>
-        <w:jc w:val="both"/>
-        <w:rPr>
-          <w:rFonts w:ascii="Times New Roman" w:eastAsia="Times New Roman" w:hAnsi="Times New Roman" w:cs="Times New Roman"/>
-          <w:sz w:val="28"/>
-          <w:szCs w:val="28"/>
-        </w:rPr>
-      </w:pPr>
-    </w:p>
-    <w:p>
-      <w:pPr>
-        <w:pStyle w:val="normal0"/>
-        <w:jc w:val="both"/>
-        <w:rPr>
-          <w:rFonts w:ascii="Times New Roman" w:eastAsia="Times New Roman" w:hAnsi="Times New Roman" w:cs="Times New Roman"/>
-          <w:b/>
-          <w:bCs/>
-          <w:sz w:val="28"/>
-          <w:szCs w:val="28"/>
-        </w:rPr>
-      </w:pPr>
-      <w:r>
-        <w:rPr>
-          <w:rFonts w:ascii="Times New Roman" w:eastAsia="Times New Roman" w:hAnsi="Times New Roman" w:cs="Times New Roman"/>
-          <w:b/>
-          <w:bCs/>
-          <w:sz w:val="28"/>
-          <w:szCs w:val="28"/>
-        </w:rPr>
-        <w:t>4.2 Hardware Interfaces</w:t>
-      </w:r>
-    </w:p>
-    <w:p>
-      <w:pPr>
-        <w:pStyle w:val="normal0"/>
-        <w:jc w:val="both"/>
-        <w:rPr>
-          <w:rFonts w:ascii="Times New Roman" w:eastAsia="Times New Roman" w:hAnsi="Times New Roman" w:cs="Times New Roman"/>
-          <w:sz w:val="28"/>
-          <w:szCs w:val="28"/>
-        </w:rPr>
-      </w:pPr>
-      <w:r>
-        <w:rPr>
-          <w:rFonts w:ascii="Times New Roman" w:eastAsia="Times New Roman" w:hAnsi="Times New Roman" w:cs="Times New Roman"/>
-          <w:sz w:val="28"/>
-          <w:szCs w:val="28"/>
-        </w:rPr>
-        <w:t>The system can be accessed using devices such as desktop computers, laptops, tablets and smartphones.</w:t>
-      </w:r>
-    </w:p>
-    <w:p>
-      <w:pPr>
-        <w:pStyle w:val="normal0"/>
-        <w:jc w:val="both"/>
-        <w:rPr>
-          <w:rFonts w:ascii="Times New Roman" w:eastAsia="Times New Roman" w:hAnsi="Times New Roman" w:cs="Times New Roman"/>
-          <w:sz w:val="28"/>
-          <w:szCs w:val="28"/>
-        </w:rPr>
-      </w:pPr>
-    </w:p>
-    <w:p>
-      <w:pPr>
-        <w:pStyle w:val="normal0"/>
-        <w:jc w:val="both"/>
-        <w:rPr>
-          <w:rFonts w:ascii="Times New Roman" w:eastAsia="Times New Roman" w:hAnsi="Times New Roman" w:cs="Times New Roman"/>
-          <w:sz w:val="28"/>
-          <w:szCs w:val="28"/>
-        </w:rPr>
-      </w:pPr>
-      <w:r>
-        <w:rPr>
-          <w:rFonts w:ascii="Times New Roman" w:eastAsia="Times New Roman" w:hAnsi="Times New Roman" w:cs="Times New Roman"/>
-          <w:sz w:val="28"/>
-          <w:szCs w:val="28"/>
-        </w:rPr>
-        <w:t>The server shall prov</w:t>
-      </w:r>
-      <w:r>
-        <w:rPr>
-          <w:rFonts w:ascii="Times New Roman" w:eastAsia="Times New Roman" w:hAnsi="Times New Roman" w:cs="Times New Roman"/>
-          <w:sz w:val="28"/>
-          <w:szCs w:val="28"/>
-        </w:rPr>
-        <w:t>ide sufficient processing and storage capacity to maintain product, customer and order information.</w:t>
+        <w:t>The server shall provide sufficient processing and storage capacity to maintain product, customer and order information.</w:t>
       </w:r>
     </w:p>
     <w:p>
@@ -3124,15 +2966,7 @@
           <w:sz w:val="28"/>
           <w:szCs w:val="28"/>
         </w:rPr>
-        <w:t>Communication involving login</w:t>
-      </w:r>
-      <w:r>
-        <w:rPr>
-          <w:rFonts w:ascii="Times New Roman" w:eastAsia="Times New Roman" w:hAnsi="Times New Roman" w:cs="Times New Roman"/>
-          <w:sz w:val="28"/>
-          <w:szCs w:val="28"/>
-        </w:rPr>
-        <w:t xml:space="preserve"> credentials, customer details and payment-related information should use secure network communication.</w:t>
+        <w:t>Communication involving login credentials, customer details and payment-related information should use secure network communication.</w:t>
       </w:r>
     </w:p>
     <w:p>
@@ -3185,7 +3019,25 @@
           <w:sz w:val="28"/>
           <w:szCs w:val="28"/>
         </w:rPr>
-        <w:t>The system shall interact with a database management system for storing customer, product, inventory and order information.</w:t>
+        <w:t xml:space="preserve">The system shall interact with a database management system for storing customer, product, </w:t>
+      </w:r>
+      <w:proofErr w:type="gramStart"/>
+      <w:r>
+        <w:rPr>
+          <w:rFonts w:ascii="Times New Roman" w:eastAsia="Times New Roman" w:hAnsi="Times New Roman" w:cs="Times New Roman"/>
+          <w:sz w:val="28"/>
+          <w:szCs w:val="28"/>
+        </w:rPr>
+        <w:t>inventory</w:t>
+      </w:r>
+      <w:proofErr w:type="gramEnd"/>
+      <w:r>
+        <w:rPr>
+          <w:rFonts w:ascii="Times New Roman" w:eastAsia="Times New Roman" w:hAnsi="Times New Roman" w:cs="Times New Roman"/>
+          <w:sz w:val="28"/>
+          <w:szCs w:val="28"/>
+        </w:rPr>
+        <w:t xml:space="preserve"> and order information.</w:t>
       </w:r>
     </w:p>
     <w:p>
@@ -3268,13 +3120,69 @@
           <w:sz w:val="28"/>
           <w:szCs w:val="28"/>
         </w:rPr>
-        <w:t>The system should provide acceptable response time during normal operation</w:t>
-      </w:r>
-      <w:r>
-        <w:rPr>
-          <w:rFonts w:ascii="Times New Roman" w:eastAsia="Times New Roman" w:hAnsi="Times New Roman" w:cs="Times New Roman"/>
-          <w:sz w:val="28"/>
-          <w:szCs w:val="28"/>
+        <w:t>The system should provide acceptable response time during normal operation.</w:t>
+      </w:r>
+    </w:p>
+    <w:p>
+      <w:pPr>
+        <w:pStyle w:val="normal0"/>
+        <w:jc w:val="both"/>
+        <w:rPr>
+          <w:rFonts w:ascii="Times New Roman" w:eastAsia="Times New Roman" w:hAnsi="Times New Roman" w:cs="Times New Roman"/>
+          <w:sz w:val="28"/>
+          <w:szCs w:val="28"/>
+        </w:rPr>
+      </w:pPr>
+    </w:p>
+    <w:p>
+      <w:pPr>
+        <w:pStyle w:val="normal0"/>
+        <w:jc w:val="both"/>
+        <w:rPr>
+          <w:rFonts w:ascii="Times New Roman" w:eastAsia="Times New Roman" w:hAnsi="Times New Roman" w:cs="Times New Roman"/>
+          <w:sz w:val="28"/>
+          <w:szCs w:val="28"/>
+        </w:rPr>
+      </w:pPr>
+      <w:r>
+        <w:rPr>
+          <w:rFonts w:ascii="Times New Roman" w:eastAsia="Times New Roman" w:hAnsi="Times New Roman" w:cs="Times New Roman"/>
+          <w:sz w:val="28"/>
+          <w:szCs w:val="28"/>
+        </w:rPr>
+        <w:t>Product pages and search results should load without unnecessary delay under normal network conditions.</w:t>
+      </w:r>
+    </w:p>
+    <w:p>
+      <w:pPr>
+        <w:pStyle w:val="normal0"/>
+        <w:jc w:val="both"/>
+        <w:rPr>
+          <w:rFonts w:ascii="Times New Roman" w:eastAsia="Times New Roman" w:hAnsi="Times New Roman" w:cs="Times New Roman"/>
+          <w:sz w:val="28"/>
+          <w:szCs w:val="28"/>
+        </w:rPr>
+      </w:pPr>
+    </w:p>
+    <w:p>
+      <w:pPr>
+        <w:pStyle w:val="NormalWeb"/>
+        <w:spacing w:before="0" w:beforeAutospacing="0" w:after="0" w:afterAutospacing="0"/>
+      </w:pPr>
+      <w:r>
+        <w:rPr>
+          <w:color w:val="000000"/>
+          <w:sz w:val="28"/>
+          <w:szCs w:val="28"/>
+        </w:rPr>
+        <w:t>The system should support at least 100 customers accessing the store simultaneously</w:t>
+      </w:r>
+      <w:r>
+        <w:rPr>
+          <w:rFonts w:ascii="Arial" w:hAnsi="Arial" w:cs="Arial"/>
+          <w:color w:val="000000"/>
+          <w:sz w:val="22"/>
+          <w:szCs w:val="22"/>
         </w:rPr>
         <w:t>.</w:t>
       </w:r>
@@ -3306,75 +3214,7 @@
           <w:sz w:val="28"/>
           <w:szCs w:val="28"/>
         </w:rPr>
-        <w:t>Product pages and search results should load without unnecessary delay under normal network conditions.</w:t>
-      </w:r>
-    </w:p>
-    <w:p>
-      <w:pPr>
-        <w:pStyle w:val="normal0"/>
-        <w:jc w:val="both"/>
-        <w:rPr>
-          <w:rFonts w:ascii="Times New Roman" w:eastAsia="Times New Roman" w:hAnsi="Times New Roman" w:cs="Times New Roman"/>
-          <w:sz w:val="28"/>
-          <w:szCs w:val="28"/>
-        </w:rPr>
-      </w:pPr>
-    </w:p>
-    <w:p>
-      <w:pPr>
-        <w:pStyle w:val="normal0"/>
-        <w:jc w:val="both"/>
-        <w:rPr>
-          <w:rFonts w:ascii="Times New Roman" w:eastAsia="Times New Roman" w:hAnsi="Times New Roman" w:cs="Times New Roman"/>
-          <w:sz w:val="28"/>
-          <w:szCs w:val="28"/>
-        </w:rPr>
-      </w:pPr>
-      <w:r>
-        <w:rPr>
-          <w:rFonts w:ascii="Times New Roman" w:eastAsia="Times New Roman" w:hAnsi="Times New Roman" w:cs="Times New Roman"/>
-          <w:sz w:val="28"/>
-          <w:szCs w:val="28"/>
-        </w:rPr>
-        <w:t>The system should support multiple customers accessing the store simultaneously.</w:t>
-      </w:r>
-    </w:p>
-    <w:p>
-      <w:pPr>
-        <w:pStyle w:val="normal0"/>
-        <w:jc w:val="both"/>
-        <w:rPr>
-          <w:rFonts w:ascii="Times New Roman" w:eastAsia="Times New Roman" w:hAnsi="Times New Roman" w:cs="Times New Roman"/>
-          <w:sz w:val="28"/>
-          <w:szCs w:val="28"/>
-        </w:rPr>
-      </w:pPr>
-    </w:p>
-    <w:p>
-      <w:pPr>
-        <w:pStyle w:val="normal0"/>
-        <w:jc w:val="both"/>
-        <w:rPr>
-          <w:rFonts w:ascii="Times New Roman" w:eastAsia="Times New Roman" w:hAnsi="Times New Roman" w:cs="Times New Roman"/>
-          <w:sz w:val="28"/>
-          <w:szCs w:val="28"/>
-        </w:rPr>
-      </w:pPr>
-      <w:r>
-        <w:rPr>
-          <w:rFonts w:ascii="Times New Roman" w:eastAsia="Times New Roman" w:hAnsi="Times New Roman" w:cs="Times New Roman"/>
-          <w:sz w:val="28"/>
-          <w:szCs w:val="28"/>
-        </w:rPr>
-        <w:t>Product stock should be updated after successful order placement t</w:t>
-      </w:r>
-      <w:r>
-        <w:rPr>
-          <w:rFonts w:ascii="Times New Roman" w:eastAsia="Times New Roman" w:hAnsi="Times New Roman" w:cs="Times New Roman"/>
-          <w:sz w:val="28"/>
-          <w:szCs w:val="28"/>
-        </w:rPr>
-        <w:t>o avoid incorrect availability information.</w:t>
+        <w:t>Product stock should be updated after successful order placement to avoid incorrect availability information.</w:t>
       </w:r>
     </w:p>
     <w:p>
@@ -3614,15 +3454,7 @@
           <w:szCs w:val="28"/>
         </w:rPr>
         <w:lastRenderedPageBreak/>
-        <w:t>The system shall prevent unaut</w:t>
-      </w:r>
-      <w:r>
-        <w:rPr>
-          <w:rFonts w:ascii="Times New Roman" w:eastAsia="Times New Roman" w:hAnsi="Times New Roman" w:cs="Times New Roman"/>
-          <w:sz w:val="28"/>
-          <w:szCs w:val="28"/>
-        </w:rPr>
-        <w:t>horized access to customer and administrative information.</w:t>
+        <w:t>The system shall prevent unauthorized access to customer and administrative information.</w:t>
       </w:r>
     </w:p>
     <w:p>
@@ -3818,15 +3650,7 @@
           <w:sz w:val="28"/>
           <w:szCs w:val="28"/>
         </w:rPr>
-        <w:t>The system should be designed in separate modules so that individual components</w:t>
-      </w:r>
-      <w:r>
-        <w:rPr>
-          <w:rFonts w:ascii="Times New Roman" w:eastAsia="Times New Roman" w:hAnsi="Times New Roman" w:cs="Times New Roman"/>
-          <w:sz w:val="28"/>
-          <w:szCs w:val="28"/>
-        </w:rPr>
-        <w:t xml:space="preserve"> can be modified without affecting the complete system.</w:t>
+        <w:t>The system should be designed in separate modules so that individual components can be modified without affecting the complete system.</w:t>
       </w:r>
     </w:p>
     <w:p>
@@ -3909,45 +3733,55 @@
           <w:sz w:val="28"/>
           <w:szCs w:val="28"/>
         </w:rPr>
-        <w:t>The web applicat</w:t>
-      </w:r>
-      <w:r>
-        <w:rPr>
-          <w:rFonts w:ascii="Times New Roman" w:eastAsia="Times New Roman" w:hAnsi="Times New Roman" w:cs="Times New Roman"/>
-          <w:sz w:val="28"/>
-          <w:szCs w:val="28"/>
-        </w:rPr>
-        <w:t>ion should work on commonly used operating systems and modern web browsers.</w:t>
-      </w:r>
-    </w:p>
-    <w:p>
-      <w:pPr>
-        <w:pStyle w:val="normal0"/>
-        <w:jc w:val="both"/>
-        <w:rPr>
-          <w:rFonts w:ascii="Times New Roman" w:eastAsia="Times New Roman" w:hAnsi="Times New Roman" w:cs="Times New Roman"/>
-          <w:sz w:val="28"/>
-          <w:szCs w:val="28"/>
-        </w:rPr>
-      </w:pPr>
-    </w:p>
-    <w:p>
-      <w:pPr>
-        <w:pStyle w:val="normal0"/>
-        <w:jc w:val="both"/>
-        <w:rPr>
-          <w:rFonts w:ascii="Times New Roman" w:eastAsia="Times New Roman" w:hAnsi="Times New Roman" w:cs="Times New Roman"/>
-          <w:sz w:val="28"/>
-          <w:szCs w:val="28"/>
-        </w:rPr>
-      </w:pPr>
-      <w:r>
-        <w:rPr>
-          <w:rFonts w:ascii="Times New Roman" w:eastAsia="Times New Roman" w:hAnsi="Times New Roman" w:cs="Times New Roman"/>
-          <w:sz w:val="28"/>
-          <w:szCs w:val="28"/>
-        </w:rPr>
-        <w:t>The interface should also adapt to different screen sizes such as computers, tablets and smartphones.</w:t>
+        <w:t>The web application should work on commonly used operating systems and modern web browsers.</w:t>
+      </w:r>
+    </w:p>
+    <w:p>
+      <w:pPr>
+        <w:pStyle w:val="normal0"/>
+        <w:jc w:val="both"/>
+        <w:rPr>
+          <w:rFonts w:ascii="Times New Roman" w:eastAsia="Times New Roman" w:hAnsi="Times New Roman" w:cs="Times New Roman"/>
+          <w:sz w:val="28"/>
+          <w:szCs w:val="28"/>
+        </w:rPr>
+      </w:pPr>
+    </w:p>
+    <w:p>
+      <w:pPr>
+        <w:pStyle w:val="normal0"/>
+        <w:jc w:val="both"/>
+        <w:rPr>
+          <w:rFonts w:ascii="Times New Roman" w:eastAsia="Times New Roman" w:hAnsi="Times New Roman" w:cs="Times New Roman"/>
+          <w:sz w:val="28"/>
+          <w:szCs w:val="28"/>
+        </w:rPr>
+      </w:pPr>
+      <w:r>
+        <w:rPr>
+          <w:rFonts w:ascii="Times New Roman" w:eastAsia="Times New Roman" w:hAnsi="Times New Roman" w:cs="Times New Roman"/>
+          <w:sz w:val="28"/>
+          <w:szCs w:val="28"/>
+        </w:rPr>
+        <w:t xml:space="preserve">The interface should also adapt to different screen sizes such as computers, tablets and </w:t>
+      </w:r>
+      <w:proofErr w:type="spellStart"/>
+      <w:r>
+        <w:rPr>
+          <w:rFonts w:ascii="Times New Roman" w:eastAsia="Times New Roman" w:hAnsi="Times New Roman" w:cs="Times New Roman"/>
+          <w:sz w:val="28"/>
+          <w:szCs w:val="28"/>
+        </w:rPr>
+        <w:t>smartphones</w:t>
+      </w:r>
+      <w:proofErr w:type="spellEnd"/>
+      <w:r>
+        <w:rPr>
+          <w:rFonts w:ascii="Times New Roman" w:eastAsia="Times New Roman" w:hAnsi="Times New Roman" w:cs="Times New Roman"/>
+          <w:sz w:val="28"/>
+          <w:szCs w:val="28"/>
+        </w:rPr>
+        <w:t>.</w:t>
       </w:r>
     </w:p>
     <w:p>
@@ -4000,15 +3834,7 @@
           <w:sz w:val="28"/>
           <w:szCs w:val="28"/>
         </w:rPr>
-        <w:t>The system should allow new functionality to be added in t</w:t>
-      </w:r>
-      <w:r>
-        <w:rPr>
-          <w:rFonts w:ascii="Times New Roman" w:eastAsia="Times New Roman" w:hAnsi="Times New Roman" w:cs="Times New Roman"/>
-          <w:sz w:val="28"/>
-          <w:szCs w:val="28"/>
-        </w:rPr>
-        <w:t>he future.</w:t>
+        <w:t>The system should allow new functionality to be added in the future.</w:t>
       </w:r>
     </w:p>
     <w:p>
@@ -4092,15 +3918,25 @@
           <w:sz w:val="28"/>
           <w:szCs w:val="28"/>
         </w:rPr>
-        <w:t>Common components such as login, authent</w:t>
-      </w:r>
-      <w:r>
-        <w:rPr>
-          <w:rFonts w:ascii="Times New Roman" w:eastAsia="Times New Roman" w:hAnsi="Times New Roman" w:cs="Times New Roman"/>
-          <w:sz w:val="28"/>
-          <w:szCs w:val="28"/>
-        </w:rPr>
-        <w:t>ication, product display and database access should be designed so that they can be reused in different modules wherever required.</w:t>
+        <w:t xml:space="preserve">Common components such as login, authentication, </w:t>
+      </w:r>
+      <w:proofErr w:type="gramStart"/>
+      <w:r>
+        <w:rPr>
+          <w:rFonts w:ascii="Times New Roman" w:eastAsia="Times New Roman" w:hAnsi="Times New Roman" w:cs="Times New Roman"/>
+          <w:sz w:val="28"/>
+          <w:szCs w:val="28"/>
+        </w:rPr>
+        <w:t>product</w:t>
+      </w:r>
+      <w:proofErr w:type="gramEnd"/>
+      <w:r>
+        <w:rPr>
+          <w:rFonts w:ascii="Times New Roman" w:eastAsia="Times New Roman" w:hAnsi="Times New Roman" w:cs="Times New Roman"/>
+          <w:sz w:val="28"/>
+          <w:szCs w:val="28"/>
+        </w:rPr>
+        <w:t xml:space="preserve"> display and database access should be designed so that they can be reused in different modules wherever required.</w:t>
       </w:r>
     </w:p>
     <w:p>
@@ -4153,15 +3989,7 @@
           <w:sz w:val="28"/>
           <w:szCs w:val="28"/>
         </w:rPr>
-        <w:t>The system should be compatible with commonly used modern web browsers and device</w:t>
-      </w:r>
-      <w:r>
-        <w:rPr>
-          <w:rFonts w:ascii="Times New Roman" w:eastAsia="Times New Roman" w:hAnsi="Times New Roman" w:cs="Times New Roman"/>
-          <w:sz w:val="28"/>
-          <w:szCs w:val="28"/>
-        </w:rPr>
-        <w:t>s.</w:t>
+        <w:t>The system should be compatible with commonly used modern web browsers and devices.</w:t>
       </w:r>
     </w:p>
     <w:p>
@@ -4244,91 +4072,67 @@
           <w:sz w:val="28"/>
           <w:szCs w:val="28"/>
         </w:rPr>
-        <w:t>A typical shopping scenario begins when a customer opens the E-Commerce Store Management System and browses the available products. The customer may search for a particular product and view its details. After selecting the required product, the customer ad</w:t>
-      </w:r>
-      <w:r>
-        <w:rPr>
-          <w:rFonts w:ascii="Times New Roman" w:eastAsia="Times New Roman" w:hAnsi="Times New Roman" w:cs="Times New Roman"/>
-          <w:sz w:val="28"/>
-          <w:szCs w:val="28"/>
-        </w:rPr>
-        <w:t>ds it to the shopping cart.</w:t>
-      </w:r>
-    </w:p>
-    <w:p>
-      <w:pPr>
-        <w:pStyle w:val="normal0"/>
-        <w:jc w:val="both"/>
-        <w:rPr>
-          <w:rFonts w:ascii="Times New Roman" w:eastAsia="Times New Roman" w:hAnsi="Times New Roman" w:cs="Times New Roman"/>
-          <w:sz w:val="28"/>
-          <w:szCs w:val="28"/>
-        </w:rPr>
-      </w:pPr>
-    </w:p>
-    <w:p>
-      <w:pPr>
-        <w:pStyle w:val="normal0"/>
-        <w:jc w:val="both"/>
-        <w:rPr>
-          <w:rFonts w:ascii="Times New Roman" w:eastAsia="Times New Roman" w:hAnsi="Times New Roman" w:cs="Times New Roman"/>
-          <w:sz w:val="28"/>
-          <w:szCs w:val="28"/>
-        </w:rPr>
-      </w:pPr>
-      <w:r>
-        <w:rPr>
-          <w:rFonts w:ascii="Times New Roman" w:eastAsia="Times New Roman" w:hAnsi="Times New Roman" w:cs="Times New Roman"/>
-          <w:sz w:val="28"/>
-          <w:szCs w:val="28"/>
-        </w:rPr>
-        <w:t>The customer reviews the cart and proceeds to checkout. The system collects the required delivery information and provides available payment options. After successful order placement, an order number and confirmation are genera</w:t>
-      </w:r>
-      <w:r>
-        <w:rPr>
-          <w:rFonts w:ascii="Times New Roman" w:eastAsia="Times New Roman" w:hAnsi="Times New Roman" w:cs="Times New Roman"/>
-          <w:sz w:val="28"/>
-          <w:szCs w:val="28"/>
-        </w:rPr>
-        <w:t>ted. The customer can later log in and check the status of the order.</w:t>
-      </w:r>
-    </w:p>
-    <w:p>
-      <w:pPr>
-        <w:pStyle w:val="normal0"/>
-        <w:jc w:val="both"/>
-        <w:rPr>
-          <w:rFonts w:ascii="Times New Roman" w:eastAsia="Times New Roman" w:hAnsi="Times New Roman" w:cs="Times New Roman"/>
-          <w:sz w:val="28"/>
-          <w:szCs w:val="28"/>
-        </w:rPr>
-      </w:pPr>
-    </w:p>
-    <w:p>
-      <w:pPr>
-        <w:pStyle w:val="normal0"/>
-        <w:jc w:val="both"/>
-        <w:rPr>
-          <w:rFonts w:ascii="Times New Roman" w:eastAsia="Times New Roman" w:hAnsi="Times New Roman" w:cs="Times New Roman"/>
-          <w:sz w:val="28"/>
-          <w:szCs w:val="28"/>
-        </w:rPr>
-      </w:pPr>
-      <w:r>
-        <w:rPr>
-          <w:rFonts w:ascii="Times New Roman" w:eastAsia="Times New Roman" w:hAnsi="Times New Roman" w:cs="Times New Roman"/>
-          <w:sz w:val="28"/>
-          <w:szCs w:val="28"/>
-        </w:rPr>
-        <w:t>For administrative operations, the administrator logs into the administrative section using authorized credentials. The administrator can add or modify products, update stock quantities</w:t>
-      </w:r>
-      <w:r>
-        <w:rPr>
-          <w:rFonts w:ascii="Times New Roman" w:eastAsia="Times New Roman" w:hAnsi="Times New Roman" w:cs="Times New Roman"/>
-          <w:sz w:val="28"/>
-          <w:szCs w:val="28"/>
-        </w:rPr>
-        <w:t>, view customer orders and update their status.</w:t>
+        <w:t>A typical shopping scenario begins when a customer opens the E-Commerce Store Management System and browses the available products. The customer may search for a particular product and view its details. After selecting the required product, the customer adds it to the shopping cart.</w:t>
+      </w:r>
+    </w:p>
+    <w:p>
+      <w:pPr>
+        <w:pStyle w:val="normal0"/>
+        <w:jc w:val="both"/>
+        <w:rPr>
+          <w:rFonts w:ascii="Times New Roman" w:eastAsia="Times New Roman" w:hAnsi="Times New Roman" w:cs="Times New Roman"/>
+          <w:sz w:val="28"/>
+          <w:szCs w:val="28"/>
+        </w:rPr>
+      </w:pPr>
+    </w:p>
+    <w:p>
+      <w:pPr>
+        <w:pStyle w:val="normal0"/>
+        <w:jc w:val="both"/>
+        <w:rPr>
+          <w:rFonts w:ascii="Times New Roman" w:eastAsia="Times New Roman" w:hAnsi="Times New Roman" w:cs="Times New Roman"/>
+          <w:sz w:val="28"/>
+          <w:szCs w:val="28"/>
+        </w:rPr>
+      </w:pPr>
+      <w:r>
+        <w:rPr>
+          <w:rFonts w:ascii="Times New Roman" w:eastAsia="Times New Roman" w:hAnsi="Times New Roman" w:cs="Times New Roman"/>
+          <w:sz w:val="28"/>
+          <w:szCs w:val="28"/>
+        </w:rPr>
+        <w:t>The customer reviews the cart and proceeds to checkout. The system collects the required delivery information and provides available payment options. After successful order placement, an order number and confirmation are generated. The customer can later log in and check the status of the order.</w:t>
+      </w:r>
+    </w:p>
+    <w:p>
+      <w:pPr>
+        <w:pStyle w:val="normal0"/>
+        <w:jc w:val="both"/>
+        <w:rPr>
+          <w:rFonts w:ascii="Times New Roman" w:eastAsia="Times New Roman" w:hAnsi="Times New Roman" w:cs="Times New Roman"/>
+          <w:sz w:val="28"/>
+          <w:szCs w:val="28"/>
+        </w:rPr>
+      </w:pPr>
+    </w:p>
+    <w:p>
+      <w:pPr>
+        <w:pStyle w:val="normal0"/>
+        <w:jc w:val="both"/>
+        <w:rPr>
+          <w:rFonts w:ascii="Times New Roman" w:eastAsia="Times New Roman" w:hAnsi="Times New Roman" w:cs="Times New Roman"/>
+          <w:sz w:val="28"/>
+          <w:szCs w:val="28"/>
+        </w:rPr>
+      </w:pPr>
+      <w:r>
+        <w:rPr>
+          <w:rFonts w:ascii="Times New Roman" w:eastAsia="Times New Roman" w:hAnsi="Times New Roman" w:cs="Times New Roman"/>
+          <w:sz w:val="28"/>
+          <w:szCs w:val="28"/>
+        </w:rPr>
+        <w:t>For administrative operations, the administrator logs into the administrative section using authorized credentials. The administrator can add or modify products, update stock quantities, view customer orders and update their status.</w:t>
       </w:r>
     </w:p>
     <w:p>
@@ -4507,17 +4311,7 @@
                 <w:sz w:val="28"/>
                 <w:szCs w:val="28"/>
               </w:rPr>
-              <w:t>Major</w:t>
-            </w:r>
-            <w:r>
-              <w:rPr>
-                <w:rFonts w:ascii="Times New Roman" w:eastAsia="Times New Roman" w:hAnsi="Times New Roman" w:cs="Times New Roman"/>
-                <w:b/>
-                <w:bCs/>
-                <w:sz w:val="28"/>
-                <w:szCs w:val="28"/>
-              </w:rPr>
-              <w:t xml:space="preserve"> Work</w:t>
+              <w:t>Major Work</w:t>
             </w:r>
           </w:p>
         </w:tc>
@@ -6177,7 +5971,7 @@
         <w:rFonts w:ascii="Arial" w:eastAsia="Arial" w:hAnsi="Arial" w:cs="Arial"/>
         <w:sz w:val="22"/>
         <w:szCs w:val="22"/>
-        <w:lang w:eastAsia="en-US" w:bidi="ar-SA"/>
+        <w:lang w:val="en-US" w:eastAsia="en-US" w:bidi="ar-SA"/>
       </w:rPr>
     </w:rPrDefault>
     <w:pPrDefault>
@@ -6328,6 +6122,7 @@
   <w:style w:type="paragraph" w:default="1" w:styleId="Normal">
     <w:name w:val="Normal"/>
     <w:qFormat/>
+    <w:rsid w:val="00A253FA"/>
   </w:style>
   <w:style w:type="paragraph" w:styleId="Heading1">
     <w:name w:val="heading 1"/>
@@ -6529,6 +6324,22 @@
         <w:right w:w="100" w:type="dxa"/>
       </w:tblCellMar>
     </w:tblPr>
+  </w:style>
+  <w:style w:type="paragraph" w:styleId="NormalWeb">
+    <w:name w:val="Normal (Web)"/>
+    <w:basedOn w:val="Normal"/>
+    <w:uiPriority w:val="99"/>
+    <w:semiHidden/>
+    <w:unhideWhenUsed/>
+    <w:rsid w:val="003B0357"/>
+    <w:pPr>
+      <w:spacing w:before="100" w:beforeAutospacing="1" w:after="100" w:afterAutospacing="1" w:line="240" w:lineRule="auto"/>
+    </w:pPr>
+    <w:rPr>
+      <w:rFonts w:ascii="Times New Roman" w:eastAsia="Times New Roman" w:hAnsi="Times New Roman" w:cs="Times New Roman"/>
+      <w:sz w:val="24"/>
+      <w:szCs w:val="24"/>
+    </w:rPr>
   </w:style>
 </w:styles>
 </file>

</xml_diff>

<commit_message>
Variant A: Add offline product browsing(SRS v2.0-A)
</commit_message>
<xml_diff>
--- a/ECMS_SRS.docx
+++ b/ECMS_SRS.docx
@@ -1001,6 +1001,29 @@
     <w:p>
       <w:pPr>
         <w:pStyle w:val="normal0"/>
+        <w:numPr>
+          <w:ilvl w:val="0"/>
+          <w:numId w:val="1"/>
+        </w:numPr>
+        <w:jc w:val="both"/>
+        <w:rPr>
+          <w:rFonts w:ascii="Times New Roman" w:eastAsia="Times New Roman" w:hAnsi="Times New Roman" w:cs="Times New Roman"/>
+          <w:sz w:val="28"/>
+          <w:szCs w:val="28"/>
+        </w:rPr>
+      </w:pPr>
+      <w:r>
+        <w:rPr>
+          <w:rFonts w:ascii="Times New Roman" w:eastAsia="Times New Roman" w:hAnsi="Times New Roman" w:cs="Times New Roman"/>
+          <w:sz w:val="28"/>
+          <w:szCs w:val="28"/>
+        </w:rPr>
+        <w:t>Offline product browsing</w:t>
+      </w:r>
+    </w:p>
+    <w:p>
+      <w:pPr>
+        <w:pStyle w:val="normal0"/>
         <w:jc w:val="both"/>
         <w:rPr>
           <w:rFonts w:ascii="Times New Roman" w:eastAsia="Times New Roman" w:hAnsi="Times New Roman" w:cs="Times New Roman"/>
@@ -1298,25 +1321,7 @@
           <w:sz w:val="28"/>
           <w:szCs w:val="28"/>
         </w:rPr>
-        <w:t xml:space="preserve">The main objectives are to provide customers with a simple and convenient shopping </w:t>
-      </w:r>
-      <w:proofErr w:type="gramStart"/>
-      <w:r>
-        <w:rPr>
-          <w:rFonts w:ascii="Times New Roman" w:eastAsia="Times New Roman" w:hAnsi="Times New Roman" w:cs="Times New Roman"/>
-          <w:sz w:val="28"/>
-          <w:szCs w:val="28"/>
-        </w:rPr>
-        <w:t>platform,</w:t>
-      </w:r>
-      <w:proofErr w:type="gramEnd"/>
-      <w:r>
-        <w:rPr>
-          <w:rFonts w:ascii="Times New Roman" w:eastAsia="Times New Roman" w:hAnsi="Times New Roman" w:cs="Times New Roman"/>
-          <w:sz w:val="28"/>
-          <w:szCs w:val="28"/>
-        </w:rPr>
-        <w:t xml:space="preserve"> allow quick searching and browsing of products, provide secure order and payment processing, maintain proper order records and help administrators efficiently manage products and inventory.</w:t>
+        <w:t>The main objectives are to provide customers with a simple and convenient shopping platform, allow quick searching and browsing of products, provide secure order and payment processing, maintain proper order records and help administrators efficiently manage products and inventory.</w:t>
       </w:r>
     </w:p>
     <w:p>
@@ -1422,25 +1427,7 @@
           <w:sz w:val="28"/>
           <w:szCs w:val="28"/>
         </w:rPr>
-        <w:t xml:space="preserve">The functional requirements describe the operations that the E-Commerce Store Management System shall perform. Following the style used in the reference </w:t>
-      </w:r>
-      <w:proofErr w:type="gramStart"/>
-      <w:r>
-        <w:rPr>
-          <w:rFonts w:ascii="Times New Roman" w:eastAsia="Times New Roman" w:hAnsi="Times New Roman" w:cs="Times New Roman"/>
-          <w:sz w:val="28"/>
-          <w:szCs w:val="28"/>
-        </w:rPr>
-        <w:t>SRS,</w:t>
-      </w:r>
-      <w:proofErr w:type="gramEnd"/>
-      <w:r>
-        <w:rPr>
-          <w:rFonts w:ascii="Times New Roman" w:eastAsia="Times New Roman" w:hAnsi="Times New Roman" w:cs="Times New Roman"/>
-          <w:sz w:val="28"/>
-          <w:szCs w:val="28"/>
-        </w:rPr>
-        <w:t xml:space="preserve"> individual requirements are expressed using “The system shall…” statements.</w:t>
+        <w:t>The functional requirements describe the operations that the E-Commerce Store Management System shall perform. Following the style used in the reference SRS, individual requirements are expressed using “The system shall…” statements.</w:t>
       </w:r>
     </w:p>
     <w:p>
@@ -2835,25 +2822,7 @@
           <w:sz w:val="28"/>
           <w:szCs w:val="28"/>
         </w:rPr>
-        <w:t xml:space="preserve">The system can be accessed using devices such as desktop computers, laptops, tablets and </w:t>
-      </w:r>
-      <w:proofErr w:type="spellStart"/>
-      <w:r>
-        <w:rPr>
-          <w:rFonts w:ascii="Times New Roman" w:eastAsia="Times New Roman" w:hAnsi="Times New Roman" w:cs="Times New Roman"/>
-          <w:sz w:val="28"/>
-          <w:szCs w:val="28"/>
-        </w:rPr>
-        <w:t>smartphones</w:t>
-      </w:r>
-      <w:proofErr w:type="spellEnd"/>
-      <w:r>
-        <w:rPr>
-          <w:rFonts w:ascii="Times New Roman" w:eastAsia="Times New Roman" w:hAnsi="Times New Roman" w:cs="Times New Roman"/>
-          <w:sz w:val="28"/>
-          <w:szCs w:val="28"/>
-        </w:rPr>
-        <w:t>.</w:t>
+        <w:t>The system can be accessed using devices such as desktop computers, laptops, tablets and smartphones.</w:t>
       </w:r>
     </w:p>
     <w:p>
@@ -3019,25 +2988,7 @@
           <w:sz w:val="28"/>
           <w:szCs w:val="28"/>
         </w:rPr>
-        <w:t xml:space="preserve">The system shall interact with a database management system for storing customer, product, </w:t>
-      </w:r>
-      <w:proofErr w:type="gramStart"/>
-      <w:r>
-        <w:rPr>
-          <w:rFonts w:ascii="Times New Roman" w:eastAsia="Times New Roman" w:hAnsi="Times New Roman" w:cs="Times New Roman"/>
-          <w:sz w:val="28"/>
-          <w:szCs w:val="28"/>
-        </w:rPr>
-        <w:t>inventory</w:t>
-      </w:r>
-      <w:proofErr w:type="gramEnd"/>
-      <w:r>
-        <w:rPr>
-          <w:rFonts w:ascii="Times New Roman" w:eastAsia="Times New Roman" w:hAnsi="Times New Roman" w:cs="Times New Roman"/>
-          <w:sz w:val="28"/>
-          <w:szCs w:val="28"/>
-        </w:rPr>
-        <w:t xml:space="preserve"> and order information.</w:t>
+        <w:t>The system shall interact with a database management system for storing customer, product, inventory and order information.</w:t>
       </w:r>
     </w:p>
     <w:p>
@@ -3763,25 +3714,7 @@
           <w:sz w:val="28"/>
           <w:szCs w:val="28"/>
         </w:rPr>
-        <w:t xml:space="preserve">The interface should also adapt to different screen sizes such as computers, tablets and </w:t>
-      </w:r>
-      <w:proofErr w:type="spellStart"/>
-      <w:r>
-        <w:rPr>
-          <w:rFonts w:ascii="Times New Roman" w:eastAsia="Times New Roman" w:hAnsi="Times New Roman" w:cs="Times New Roman"/>
-          <w:sz w:val="28"/>
-          <w:szCs w:val="28"/>
-        </w:rPr>
-        <w:t>smartphones</w:t>
-      </w:r>
-      <w:proofErr w:type="spellEnd"/>
-      <w:r>
-        <w:rPr>
-          <w:rFonts w:ascii="Times New Roman" w:eastAsia="Times New Roman" w:hAnsi="Times New Roman" w:cs="Times New Roman"/>
-          <w:sz w:val="28"/>
-          <w:szCs w:val="28"/>
-        </w:rPr>
-        <w:t>.</w:t>
+        <w:t>The interface should also adapt to different screen sizes such as computers, tablets and smartphones.</w:t>
       </w:r>
     </w:p>
     <w:p>
@@ -3918,25 +3851,7 @@
           <w:sz w:val="28"/>
           <w:szCs w:val="28"/>
         </w:rPr>
-        <w:t xml:space="preserve">Common components such as login, authentication, </w:t>
-      </w:r>
-      <w:proofErr w:type="gramStart"/>
-      <w:r>
-        <w:rPr>
-          <w:rFonts w:ascii="Times New Roman" w:eastAsia="Times New Roman" w:hAnsi="Times New Roman" w:cs="Times New Roman"/>
-          <w:sz w:val="28"/>
-          <w:szCs w:val="28"/>
-        </w:rPr>
-        <w:t>product</w:t>
-      </w:r>
-      <w:proofErr w:type="gramEnd"/>
-      <w:r>
-        <w:rPr>
-          <w:rFonts w:ascii="Times New Roman" w:eastAsia="Times New Roman" w:hAnsi="Times New Roman" w:cs="Times New Roman"/>
-          <w:sz w:val="28"/>
-          <w:szCs w:val="28"/>
-        </w:rPr>
-        <w:t xml:space="preserve"> display and database access should be designed so that they can be reused in different modules wherever required.</w:t>
+        <w:t>Common components such as login, authentication, product display and database access should be designed so that they can be reused in different modules wherever required.</w:t>
       </w:r>
     </w:p>
     <w:p>

</xml_diff>

<commit_message>
Variant B: Add social sharing of products(SRS v2.0-B)
</commit_message>
<xml_diff>
--- a/ECMS_SRS.docx
+++ b/ECMS_SRS.docx
@@ -1001,6 +1001,29 @@
     <w:p>
       <w:pPr>
         <w:pStyle w:val="normal0"/>
+        <w:numPr>
+          <w:ilvl w:val="0"/>
+          <w:numId w:val="1"/>
+        </w:numPr>
+        <w:jc w:val="both"/>
+        <w:rPr>
+          <w:rFonts w:ascii="Times New Roman" w:eastAsia="Times New Roman" w:hAnsi="Times New Roman" w:cs="Times New Roman"/>
+          <w:sz w:val="28"/>
+          <w:szCs w:val="28"/>
+        </w:rPr>
+      </w:pPr>
+      <w:r>
+        <w:rPr>
+          <w:rFonts w:ascii="Times New Roman" w:eastAsia="Times New Roman" w:hAnsi="Times New Roman" w:cs="Times New Roman"/>
+          <w:sz w:val="28"/>
+          <w:szCs w:val="28"/>
+        </w:rPr>
+        <w:t>Social sharing of products</w:t>
+      </w:r>
+    </w:p>
+    <w:p>
+      <w:pPr>
+        <w:pStyle w:val="normal0"/>
         <w:jc w:val="both"/>
         <w:rPr>
           <w:rFonts w:ascii="Times New Roman" w:eastAsia="Times New Roman" w:hAnsi="Times New Roman" w:cs="Times New Roman"/>
@@ -1298,25 +1321,7 @@
           <w:sz w:val="28"/>
           <w:szCs w:val="28"/>
         </w:rPr>
-        <w:t xml:space="preserve">The main objectives are to provide customers with a simple and convenient shopping </w:t>
-      </w:r>
-      <w:proofErr w:type="gramStart"/>
-      <w:r>
-        <w:rPr>
-          <w:rFonts w:ascii="Times New Roman" w:eastAsia="Times New Roman" w:hAnsi="Times New Roman" w:cs="Times New Roman"/>
-          <w:sz w:val="28"/>
-          <w:szCs w:val="28"/>
-        </w:rPr>
-        <w:t>platform,</w:t>
-      </w:r>
-      <w:proofErr w:type="gramEnd"/>
-      <w:r>
-        <w:rPr>
-          <w:rFonts w:ascii="Times New Roman" w:eastAsia="Times New Roman" w:hAnsi="Times New Roman" w:cs="Times New Roman"/>
-          <w:sz w:val="28"/>
-          <w:szCs w:val="28"/>
-        </w:rPr>
-        <w:t xml:space="preserve"> allow quick searching and browsing of products, provide secure order and payment processing, maintain proper order records and help administrators efficiently manage products and inventory.</w:t>
+        <w:t>The main objectives are to provide customers with a simple and convenient shopping platform, allow quick searching and browsing of products, provide secure order and payment processing, maintain proper order records and help administrators efficiently manage products and inventory.</w:t>
       </w:r>
     </w:p>
     <w:p>
@@ -1422,25 +1427,7 @@
           <w:sz w:val="28"/>
           <w:szCs w:val="28"/>
         </w:rPr>
-        <w:t xml:space="preserve">The functional requirements describe the operations that the E-Commerce Store Management System shall perform. Following the style used in the reference </w:t>
-      </w:r>
-      <w:proofErr w:type="gramStart"/>
-      <w:r>
-        <w:rPr>
-          <w:rFonts w:ascii="Times New Roman" w:eastAsia="Times New Roman" w:hAnsi="Times New Roman" w:cs="Times New Roman"/>
-          <w:sz w:val="28"/>
-          <w:szCs w:val="28"/>
-        </w:rPr>
-        <w:t>SRS,</w:t>
-      </w:r>
-      <w:proofErr w:type="gramEnd"/>
-      <w:r>
-        <w:rPr>
-          <w:rFonts w:ascii="Times New Roman" w:eastAsia="Times New Roman" w:hAnsi="Times New Roman" w:cs="Times New Roman"/>
-          <w:sz w:val="28"/>
-          <w:szCs w:val="28"/>
-        </w:rPr>
-        <w:t xml:space="preserve"> individual requirements are expressed using “The system shall…” statements.</w:t>
+        <w:t>The functional requirements describe the operations that the E-Commerce Store Management System shall perform. Following the style used in the reference SRS, individual requirements are expressed using “The system shall…” statements.</w:t>
       </w:r>
     </w:p>
     <w:p>
@@ -2835,25 +2822,7 @@
           <w:sz w:val="28"/>
           <w:szCs w:val="28"/>
         </w:rPr>
-        <w:t xml:space="preserve">The system can be accessed using devices such as desktop computers, laptops, tablets and </w:t>
-      </w:r>
-      <w:proofErr w:type="spellStart"/>
-      <w:r>
-        <w:rPr>
-          <w:rFonts w:ascii="Times New Roman" w:eastAsia="Times New Roman" w:hAnsi="Times New Roman" w:cs="Times New Roman"/>
-          <w:sz w:val="28"/>
-          <w:szCs w:val="28"/>
-        </w:rPr>
-        <w:t>smartphones</w:t>
-      </w:r>
-      <w:proofErr w:type="spellEnd"/>
-      <w:r>
-        <w:rPr>
-          <w:rFonts w:ascii="Times New Roman" w:eastAsia="Times New Roman" w:hAnsi="Times New Roman" w:cs="Times New Roman"/>
-          <w:sz w:val="28"/>
-          <w:szCs w:val="28"/>
-        </w:rPr>
-        <w:t>.</w:t>
+        <w:t>The system can be accessed using devices such as desktop computers, laptops, tablets and smartphones.</w:t>
       </w:r>
     </w:p>
     <w:p>
@@ -3019,25 +2988,7 @@
           <w:sz w:val="28"/>
           <w:szCs w:val="28"/>
         </w:rPr>
-        <w:t xml:space="preserve">The system shall interact with a database management system for storing customer, product, </w:t>
-      </w:r>
-      <w:proofErr w:type="gramStart"/>
-      <w:r>
-        <w:rPr>
-          <w:rFonts w:ascii="Times New Roman" w:eastAsia="Times New Roman" w:hAnsi="Times New Roman" w:cs="Times New Roman"/>
-          <w:sz w:val="28"/>
-          <w:szCs w:val="28"/>
-        </w:rPr>
-        <w:t>inventory</w:t>
-      </w:r>
-      <w:proofErr w:type="gramEnd"/>
-      <w:r>
-        <w:rPr>
-          <w:rFonts w:ascii="Times New Roman" w:eastAsia="Times New Roman" w:hAnsi="Times New Roman" w:cs="Times New Roman"/>
-          <w:sz w:val="28"/>
-          <w:szCs w:val="28"/>
-        </w:rPr>
-        <w:t xml:space="preserve"> and order information.</w:t>
+        <w:t>The system shall interact with a database management system for storing customer, product, inventory and order information.</w:t>
       </w:r>
     </w:p>
     <w:p>
@@ -3763,25 +3714,7 @@
           <w:sz w:val="28"/>
           <w:szCs w:val="28"/>
         </w:rPr>
-        <w:t xml:space="preserve">The interface should also adapt to different screen sizes such as computers, tablets and </w:t>
-      </w:r>
-      <w:proofErr w:type="spellStart"/>
-      <w:r>
-        <w:rPr>
-          <w:rFonts w:ascii="Times New Roman" w:eastAsia="Times New Roman" w:hAnsi="Times New Roman" w:cs="Times New Roman"/>
-          <w:sz w:val="28"/>
-          <w:szCs w:val="28"/>
-        </w:rPr>
-        <w:t>smartphones</w:t>
-      </w:r>
-      <w:proofErr w:type="spellEnd"/>
-      <w:r>
-        <w:rPr>
-          <w:rFonts w:ascii="Times New Roman" w:eastAsia="Times New Roman" w:hAnsi="Times New Roman" w:cs="Times New Roman"/>
-          <w:sz w:val="28"/>
-          <w:szCs w:val="28"/>
-        </w:rPr>
-        <w:t>.</w:t>
+        <w:t>The interface should also adapt to different screen sizes such as computers, tablets and smartphones.</w:t>
       </w:r>
     </w:p>
     <w:p>
@@ -3918,25 +3851,7 @@
           <w:sz w:val="28"/>
           <w:szCs w:val="28"/>
         </w:rPr>
-        <w:t xml:space="preserve">Common components such as login, authentication, </w:t>
-      </w:r>
-      <w:proofErr w:type="gramStart"/>
-      <w:r>
-        <w:rPr>
-          <w:rFonts w:ascii="Times New Roman" w:eastAsia="Times New Roman" w:hAnsi="Times New Roman" w:cs="Times New Roman"/>
-          <w:sz w:val="28"/>
-          <w:szCs w:val="28"/>
-        </w:rPr>
-        <w:t>product</w:t>
-      </w:r>
-      <w:proofErr w:type="gramEnd"/>
-      <w:r>
-        <w:rPr>
-          <w:rFonts w:ascii="Times New Roman" w:eastAsia="Times New Roman" w:hAnsi="Times New Roman" w:cs="Times New Roman"/>
-          <w:sz w:val="28"/>
-          <w:szCs w:val="28"/>
-        </w:rPr>
-        <w:t xml:space="preserve"> display and database access should be designed so that they can be reused in different modules wherever required.</w:t>
+        <w:t>Common components such as login, authentication, product display and database access should be designed so that they can be reused in different modules wherever required.</w:t>
       </w:r>
     </w:p>
     <w:p>

</xml_diff>